<commit_message>
Update platform docs; tidy .gitignore
</commit_message>
<xml_diff>
--- a/docs/vakilim-platform-documentation.docx
+++ b/docs/vakilim-platform-documentation.docx
@@ -14535,7 +14535,7 @@
           <w:sz w:val="22"/>
           <w:szCs w:val="22"/>
         </w:rPr>
-        <w:t xml:space="preserve">Sentry (@sentry/nextjs) captures unhandled client, server and edge exceptions with source-mapped stack traces; instrumentation hooks plus app/global-error.tsx. Initializes to a no-op without a DSN, so local development stays quiet.</w:t>
+        <w:t xml:space="preserve">Sentry (@sentry/nextjs) captures unhandled client, server and edge exceptions across instrumentation hooks plus app/global-error.tsx. The DSN is hardcoded in the three config files (correct — a DSN is not a secret; it permits sending events only), so capture works in every environment without configuration. SENTRY_AUTH_TOKEN lives in the gitignored .env.sentry-build-plugin and must be set on the host for production source-map upload; without it stack traces point at minified bundles.</w:t>
       </w:r>
     </w:p>
     <w:p>
@@ -14683,6 +14683,27 @@
           <w:szCs w:val="22"/>
         </w:rPr>
         <w:t xml:space="preserve">Client opens within 72h of completion; lawyer answers within 48h (auto-nudge); admin resolves with an optional refund in qəpik that is subtracted from the lawyer's net earnings.</w:t>
+      </w:r>
+    </w:p>
+    <w:p>
+      <w:pPr>
+        <w:pStyle w:val="Heading2"/>
+        <w:spacing w:after="120" w:before="240"/>
+      </w:pPr>
+      <w:r>
+        <w:t xml:space="preserve">Transactional email</w:t>
+      </w:r>
+    </w:p>
+    <w:p>
+      <w:pPr>
+        <w:spacing w:after="120"/>
+      </w:pPr>
+      <w:r>
+        <w:rPr>
+          <w:sz w:val="22"/>
+          <w:szCs w:val="22"/>
+        </w:rPr>
+        <w:t xml:space="preserve">lib/auth-mail.ts renders trilingual subject/body pairs (verify, reset) as flat strings; lib/email.ts posts them to Resend's HTTP API directly — no SDK. Without RESEND_API_KEY the same call logs an [EMAIL DEV] block to the server console and reports ok, so every flow stays demoable. The sender comes from EMAIL_FROM; the fallback (onboarding@resend.dev) is Resend's shared test address and delivers only to the account owner, so EMAIL_FROM must be set to a verified domain before real users are invited.</w:t>
       </w:r>
     </w:p>
     <w:p>
@@ -15229,7 +15250,7 @@
                 <w:sz w:val="19"/>
                 <w:szCs w:val="19"/>
               </w:rPr>
-              <w:t xml:space="preserve">Transactional email</w:t>
+              <w:t xml:space="preserve">Transactional email via Resend HTTP API</w:t>
             </w:r>
           </w:p>
         </w:tc>
@@ -15275,7 +15296,7 @@
                 <w:sz w:val="19"/>
                 <w:szCs w:val="19"/>
               </w:rPr>
-              <w:t xml:space="preserve">OTP_DEV_ECHO</w:t>
+              <w:t xml:space="preserve">EMAIL_FROM</w:t>
             </w:r>
           </w:p>
         </w:tc>
@@ -15297,7 +15318,7 @@
                 <w:sz w:val="19"/>
                 <w:szCs w:val="19"/>
               </w:rPr>
-              <w:t xml:space="preserve">true → codes/links echoed on-screen ([DEV])</w:t>
+              <w:t xml:space="preserve">Sender identity — must be a verified domain address; the onboarding@resend.dev fallback reaches only the account owner</w:t>
             </w:r>
           </w:p>
         </w:tc>
@@ -15319,7 +15340,7 @@
                 <w:sz w:val="19"/>
                 <w:szCs w:val="19"/>
               </w:rPr>
-              <w:t xml:space="preserve">beta mode switch</w:t>
+              <w:t xml:space="preserve">required with Resend</w:t>
             </w:r>
           </w:p>
         </w:tc>
@@ -15343,7 +15364,7 @@
                 <w:sz w:val="19"/>
                 <w:szCs w:val="19"/>
               </w:rPr>
-              <w:t xml:space="preserve">WHATSAPP_* (per README-whatsapp)</w:t>
+              <w:t xml:space="preserve">OTP_DEV_ECHO</w:t>
             </w:r>
           </w:p>
         </w:tc>
@@ -15365,7 +15386,7 @@
                 <w:sz w:val="19"/>
                 <w:szCs w:val="19"/>
               </w:rPr>
-              <w:t xml:space="preserve">Real OTP delivery</w:t>
+              <w:t xml:space="preserve">true → codes/links echoed on-screen ([DEV])</w:t>
             </w:r>
           </w:p>
         </w:tc>
@@ -15387,7 +15408,7 @@
                 <w:sz w:val="19"/>
                 <w:szCs w:val="19"/>
               </w:rPr>
-              <w:t xml:space="preserve">beta gate №2 for strangers</w:t>
+              <w:t xml:space="preserve">beta mode switch</w:t>
             </w:r>
           </w:p>
         </w:tc>
@@ -15411,7 +15432,7 @@
                 <w:sz w:val="19"/>
                 <w:szCs w:val="19"/>
               </w:rPr>
-              <w:t xml:space="preserve">GOOGLE_CLIENT_ID / _SECRET / NEXT_PUBLIC_GOOGLE_LOGIN</w:t>
+              <w:t xml:space="preserve">WHATSAPP_* (per README-whatsapp)</w:t>
             </w:r>
           </w:p>
         </w:tc>
@@ -15433,7 +15454,7 @@
                 <w:sz w:val="19"/>
                 <w:szCs w:val="19"/>
               </w:rPr>
-              <w:t xml:space="preserve">Google sign-in</w:t>
+              <w:t xml:space="preserve">Real OTP delivery</w:t>
             </w:r>
           </w:p>
         </w:tc>
@@ -15455,7 +15476,7 @@
                 <w:sz w:val="19"/>
                 <w:szCs w:val="19"/>
               </w:rPr>
-              <w:t xml:space="preserve">5-min Console setup</w:t>
+              <w:t xml:space="preserve">beta gate №2 for strangers</w:t>
             </w:r>
           </w:p>
         </w:tc>
@@ -15479,7 +15500,7 @@
                 <w:sz w:val="19"/>
                 <w:szCs w:val="19"/>
               </w:rPr>
-              <w:t xml:space="preserve">NEXT_PUBLIC_APPLE_LOGIN (+ future APPLE_*)</w:t>
+              <w:t xml:space="preserve">GOOGLE_CLIENT_ID / _SECRET / NEXT_PUBLIC_GOOGLE_LOGIN</w:t>
             </w:r>
           </w:p>
         </w:tc>
@@ -15501,7 +15522,7 @@
                 <w:sz w:val="19"/>
                 <w:szCs w:val="19"/>
               </w:rPr>
-              <w:t xml:space="preserve">Apple button (route pending $99 program)</w:t>
+              <w:t xml:space="preserve">Google sign-in</w:t>
             </w:r>
           </w:p>
         </w:tc>
@@ -15523,7 +15544,7 @@
                 <w:sz w:val="19"/>
                 <w:szCs w:val="19"/>
               </w:rPr>
-              <w:t xml:space="preserve">dormant</w:t>
+              <w:t xml:space="preserve">5-min Console setup</w:t>
             </w:r>
           </w:p>
         </w:tc>
@@ -15547,7 +15568,7 @@
                 <w:sz w:val="19"/>
                 <w:szCs w:val="19"/>
               </w:rPr>
-              <w:t xml:space="preserve">ANTHROPIC_API_KEY / ANTHROPIC_MODEL</w:t>
+              <w:t xml:space="preserve">NEXT_PUBLIC_APPLE_LOGIN (+ future APPLE_*)</w:t>
             </w:r>
           </w:p>
         </w:tc>
@@ -15569,7 +15590,7 @@
                 <w:sz w:val="19"/>
                 <w:szCs w:val="19"/>
               </w:rPr>
-              <w:t xml:space="preserve">AI intake brain</w:t>
+              <w:t xml:space="preserve">Apple button (route pending $99 program)</w:t>
             </w:r>
           </w:p>
         </w:tc>
@@ -15591,7 +15612,7 @@
                 <w:sz w:val="19"/>
                 <w:szCs w:val="19"/>
               </w:rPr>
-              <w:t xml:space="preserve">optional (echo fallback)</w:t>
+              <w:t xml:space="preserve">dormant</w:t>
             </w:r>
           </w:p>
         </w:tc>
@@ -15615,7 +15636,7 @@
                 <w:sz w:val="19"/>
                 <w:szCs w:val="19"/>
               </w:rPr>
-              <w:t xml:space="preserve">JOBS_KEY (tick ?key)</w:t>
+              <w:t xml:space="preserve">ANTHROPIC_API_KEY / ANTHROPIC_MODEL</w:t>
             </w:r>
           </w:p>
         </w:tc>
@@ -15637,7 +15658,7 @@
                 <w:sz w:val="19"/>
                 <w:szCs w:val="19"/>
               </w:rPr>
-              <w:t xml:space="preserve">Cron authentication</w:t>
+              <w:t xml:space="preserve">AI intake brain</w:t>
             </w:r>
           </w:p>
         </w:tc>
@@ -15659,7 +15680,7 @@
                 <w:sz w:val="19"/>
                 <w:szCs w:val="19"/>
               </w:rPr>
-              <w:t xml:space="preserve">required</w:t>
+              <w:t xml:space="preserve">optional (echo fallback)</w:t>
             </w:r>
           </w:p>
         </w:tc>
@@ -15683,7 +15704,7 @@
                 <w:sz w:val="19"/>
                 <w:szCs w:val="19"/>
               </w:rPr>
-              <w:t xml:space="preserve">NEXT_PUBLIC_GAـID (GA4)</w:t>
+              <w:t xml:space="preserve">JOBS_KEY (tick ?key)</w:t>
             </w:r>
           </w:p>
         </w:tc>
@@ -15705,7 +15726,7 @@
                 <w:sz w:val="19"/>
                 <w:szCs w:val="19"/>
               </w:rPr>
-              <w:t xml:space="preserve">Analytics</w:t>
+              <w:t xml:space="preserve">Cron authentication</w:t>
             </w:r>
           </w:p>
         </w:tc>
@@ -15727,7 +15748,7 @@
                 <w:sz w:val="19"/>
                 <w:szCs w:val="19"/>
               </w:rPr>
-              <w:t xml:space="preserve">optional</w:t>
+              <w:t xml:space="preserve">required</w:t>
             </w:r>
           </w:p>
         </w:tc>
@@ -15751,7 +15772,7 @@
                 <w:sz w:val="19"/>
                 <w:szCs w:val="19"/>
               </w:rPr>
-              <w:t xml:space="preserve">SENTRY_DSN / SENTRY_AUTH_TOKEN</w:t>
+              <w:t xml:space="preserve">NEXT_PUBLIC_GAـID (GA4)</w:t>
             </w:r>
           </w:p>
         </w:tc>
@@ -15773,7 +15794,7 @@
                 <w:sz w:val="19"/>
                 <w:szCs w:val="19"/>
               </w:rPr>
-              <w:t xml:space="preserve">Error monitoring + source-map upload</w:t>
+              <w:t xml:space="preserve">Analytics</w:t>
             </w:r>
           </w:p>
         </w:tc>
@@ -15795,7 +15816,75 @@
                 <w:sz w:val="19"/>
                 <w:szCs w:val="19"/>
               </w:rPr>
-              <w:t xml:space="preserve">✅ wired (wizard)</w:t>
+              <w:t xml:space="preserve">optional</w:t>
+            </w:r>
+          </w:p>
+        </w:tc>
+      </w:tr>
+      <w:tr>
+        <w:tc>
+          <w:tcPr>
+            <w:tcW w:type="dxa" w:w="3400"/>
+            <w:tcMar>
+              <w:top w:type="dxa" w:w="60"/>
+              <w:left w:type="dxa" w:w="100"/>
+              <w:bottom w:type="dxa" w:w="60"/>
+              <w:right w:type="dxa" w:w="100"/>
+            </w:tcMar>
+          </w:tcPr>
+          <w:p>
+            <w:r>
+              <w:rPr>
+                <w:b w:val="false"/>
+                <w:bCs w:val="false"/>
+                <w:sz w:val="19"/>
+                <w:szCs w:val="19"/>
+              </w:rPr>
+              <w:t xml:space="preserve">SENTRY_AUTH_TOKEN</w:t>
+            </w:r>
+          </w:p>
+        </w:tc>
+        <w:tc>
+          <w:tcPr>
+            <w:tcW w:type="dxa" w:w="4160"/>
+            <w:tcMar>
+              <w:top w:type="dxa" w:w="60"/>
+              <w:left w:type="dxa" w:w="100"/>
+              <w:bottom w:type="dxa" w:w="60"/>
+              <w:right w:type="dxa" w:w="100"/>
+            </w:tcMar>
+          </w:tcPr>
+          <w:p>
+            <w:r>
+              <w:rPr>
+                <w:b w:val="false"/>
+                <w:bCs w:val="false"/>
+                <w:sz w:val="19"/>
+                <w:szCs w:val="19"/>
+              </w:rPr>
+              <w:t xml:space="preserve">Source-map upload at build time (DSN is hardcoded in config, not an env var)</w:t>
+            </w:r>
+          </w:p>
+        </w:tc>
+        <w:tc>
+          <w:tcPr>
+            <w:tcW w:type="dxa" w:w="1800"/>
+            <w:tcMar>
+              <w:top w:type="dxa" w:w="60"/>
+              <w:left w:type="dxa" w:w="100"/>
+              <w:bottom w:type="dxa" w:w="60"/>
+              <w:right w:type="dxa" w:w="100"/>
+            </w:tcMar>
+          </w:tcPr>
+          <w:p>
+            <w:r>
+              <w:rPr>
+                <w:b w:val="false"/>
+                <w:bCs w:val="false"/>
+                <w:sz w:val="19"/>
+                <w:szCs w:val="19"/>
+              </w:rPr>
+              <w:t xml:space="preserve">✅ wired / set on host</w:t>
             </w:r>
           </w:p>
         </w:tc>
@@ -15926,7 +16015,7 @@
           <w:sz w:val="22"/>
           <w:szCs w:val="22"/>
         </w:rPr>
-        <w:t xml:space="preserve">Email delivery requires the Resend key; without it verification/reset links exist only as on-screen [DEV] links.</w:t>
+        <w:t xml:space="preserve">Email delivery requires RESEND_API_KEY plus EMAIL_FROM; without the key, verification/reset links exist only as on-screen [DEV] links and a server-console block. sendEmail returns { ok: res.ok } without inspecting or logging Resend's error body, so a rejected send (bad sender domain, dead key) currently fails silently — capture is a small pending patch now that Sentry is live.</w:t>
       </w:r>
     </w:p>
     <w:p>
@@ -19625,7 +19714,7 @@
                 <w:sz w:val="19"/>
                 <w:szCs w:val="19"/>
               </w:rPr>
-              <w:t xml:space="preserve">Resend account ready — sendMail() send-path still unbuilt</w:t>
+              <w:t xml:space="preserve">Resend transactional email (lib/email.ts → Resend HTTP API, dev-console fallback)</w:t>
             </w:r>
           </w:p>
         </w:tc>
@@ -19647,7 +19736,7 @@
                 <w:sz w:val="19"/>
                 <w:szCs w:val="19"/>
               </w:rPr>
-              <w:t xml:space="preserve">🔄 code sprint pending</w:t>
+              <w:t xml:space="preserve">✅ code / 🔄 your key</w:t>
             </w:r>
           </w:p>
         </w:tc>
@@ -19669,7 +19758,7 @@
                 <w:sz w:val="19"/>
                 <w:szCs w:val="19"/>
               </w:rPr>
-              <w:t xml:space="preserve">—</w:t>
+              <w:t xml:space="preserve">code 100</w:t>
             </w:r>
           </w:p>
         </w:tc>

</xml_diff>